<commit_message>
doc: revise Travel Motor thermal report to 100% English and update Drive C anomaly description
</commit_message>
<xml_diff>
--- a/docs/report/Travel_Motor_Multi_Trial_Thermal_Report.docx
+++ b/docs/report/Travel_Motor_Multi_Trial_Thermal_Report.docx
@@ -12,9 +12,9 @@
           <w:rFonts w:ascii="Arial" w:hAnsi="Arial"/>
           <w:b/>
           <w:color w:val="1B365D"/>
-          <w:sz w:val="36"/>
+          <w:sz w:val="32"/>
         </w:rPr>
-        <w:t>BÁO CÁO TỔNG HỢP: HIỆU SUẤT NHIỆT HỆ THỐNG TRAVEL</w:t>
+        <w:t>MULTI-TRIAL TELEMETRY REPORT: TRAVEL SYSTEM THERMAL PERFORMANCE</w:t>
       </w:r>
     </w:p>
     <w:p>
@@ -26,9 +26,9 @@
           <w:rFonts w:ascii="Arial" w:hAnsi="Arial"/>
           <w:i/>
           <w:color w:val="555555"/>
-          <w:sz w:val="24"/>
+          <w:sz w:val="23"/>
         </w:rPr>
-        <w:t>Đánh giá dữ liệu Telemetry gia nhiệt và làm mát tự nhiên qua 5 lần thử nghiệm</w:t>
+        <w:t>Evaluation of laden heating and natural cooling telemetry across 5 trials</w:t>
       </w:r>
     </w:p>
     <w:p>
@@ -40,13 +40,13 @@
           <w:color w:val="777777"/>
           <w:sz w:val="19"/>
         </w:rPr>
-        <w:t>Mẫu xe: Isoloader MJ35 Gantry Crane</w:t>
+        <w:t>Vehicle Model: Isoloader MJ35 Gantry Crane</w:t>
         <w:br/>
-        <w:t>Tải trọng thử nghiệm: 20 Tấn (Laden)</w:t>
+        <w:t>Test Load: 20 Tons (Laden Travel)</w:t>
         <w:br/>
-        <w:t>Ngày phân tích: 29/06/2026</w:t>
+        <w:t>Analysis Date: June 29, 2026</w:t>
         <w:br/>
-        <w:t>Trạng thái tài liệu: Final Report</w:t>
+        <w:t>Document Status: Final Report</w:t>
       </w:r>
     </w:p>
     <w:p>
@@ -65,9 +65,9 @@
         <w:rPr>
           <w:b/>
           <w:color w:val="1B365D"/>
-          <w:sz w:val="28"/>
+          <w:sz w:val="26"/>
         </w:rPr>
-        <w:t>1. Tóm tắt dự án &amp; Tổng quan thử nghiệm</w:t>
+        <w:t>1. Executive Summary &amp; Test Overview</w:t>
       </w:r>
     </w:p>
     <w:p>
@@ -75,7 +75,7 @@
         <w:spacing w:after="160"/>
       </w:pPr>
       <w:r>
-        <w:t>Báo cáo này tổng hợp dữ liệu nhiệt độ động cơ và dòng điện hoạt động của hệ thống di chuyển (Travel / Traction) trên xe gantry crane Isoloader MJ35 qua 5 lần thử nghiệm thực tế dưới tải trọng 20 tấn (Laden Travel) và các pha làm mát tự nhiên tương ứng khi dừng xe (Natural Cooling). Dữ liệu được trích xuất trực tiếp từ các file nhật ký telemetry của hệ thống PLC.</w:t>
+        <w:t>This report compiles and analyzes the motor temperatures and operational currents of the travel system (transA, B, C, D) on the Isoloader MJ35 gantry crane across 5 trials. The testing program evaluated both laden travel runs under a 20-ton load and natural cooling phases when the vehicle was stationary. The data is extracted directly from the system's PLC telemetry logs.</w:t>
       </w:r>
     </w:p>
     <w:p>
@@ -83,7 +83,7 @@
         <w:spacing w:after="240"/>
       </w:pPr>
       <w:r>
-        <w:t>Mục đích của báo cáo nhằm xác nhận tính ổn định nhiệt của các động cơ di chuyển (transA, B, C, D), đánh giá độ chính xác của hệ thống cảnh báo nhiệt độ trên HMI, kiểm chứng cơ chế tự động giảm hiệu suất bảo vệ (cutback) của PLC và xác minh hiện tượng kẹt phanh cơ khí trên bánh xe C.</w:t>
+        <w:t>The primary goals are to evaluate thermal stability under laden conditions, verify HMI temperature warning indications, test PLC thermal cutback limits, and analyze the cooling rates. Additionally, a persistent abnormal thermal and electrical signature was detected on Travel Drive C (transC), which requires motor replacement to rule out any vehicle architectural influences.</w:t>
       </w:r>
     </w:p>
     <w:p>
@@ -94,9 +94,9 @@
         <w:rPr>
           <w:b/>
           <w:color w:val="1B365D"/>
-          <w:sz w:val="28"/>
+          <w:sz w:val="26"/>
         </w:rPr>
-        <w:t>2. So sánh Telemetry pha chạy có tải (Heating Phase)</w:t>
+        <w:t>2. Laden Travel Telemetry Comparison (Heating Phase)</w:t>
       </w:r>
     </w:p>
     <w:p>
@@ -104,7 +104,7 @@
         <w:spacing w:after="160"/>
       </w:pPr>
       <w:r>
-        <w:t>Thống kê dữ liệu chạy có tải qua các lần thử (Try 1, 2, 3, 5). Lần thử 4 bị loại bỏ do thời gian chạy quá ngắn (4 phút) và không có dòng điện hoạt động (bị hủy bỏ giữa chừng). Thời gian chạy liên tục lớn nhất đạt 45.51 phút ở Lần thử 5 (khoảng 1.5 - 2 km).</w:t>
+        <w:t>The table below summarizes the thermal development and average current draws during active travel under a 20T load. Trial 4 is classified as Aborted due to its short duration (4.03 min) and lack of current/heating data. Trial 5 represents the longest continuous travel run of 45.51 minutes (approx. 1.5 - 2.0 km).</w:t>
       </w:r>
     </w:p>
     <w:tbl>
@@ -152,7 +152,7 @@
                 <w:color w:val="FFFFFF"/>
                 <w:sz w:val="19"/>
               </w:rPr>
-              <w:t>Động cơ</w:t>
+              <w:t>Motor ID</w:t>
             </w:r>
           </w:p>
         </w:tc>
@@ -177,7 +177,7 @@
                 <w:color w:val="FFFFFF"/>
                 <w:sz w:val="19"/>
               </w:rPr>
-              <w:t>Try 1 (21.5 phút)</w:t>
+              <w:t>Try 1 (21.5 min)</w:t>
             </w:r>
           </w:p>
         </w:tc>
@@ -202,7 +202,7 @@
                 <w:color w:val="FFFFFF"/>
                 <w:sz w:val="19"/>
               </w:rPr>
-              <w:t>Try 2 (22.3 phút)</w:t>
+              <w:t>Try 2 (22.3 min)</w:t>
             </w:r>
           </w:p>
         </w:tc>
@@ -227,7 +227,7 @@
                 <w:color w:val="FFFFFF"/>
                 <w:sz w:val="19"/>
               </w:rPr>
-              <w:t>Try 3 (34.6 phút)</w:t>
+              <w:t>Try 3 (34.6 min)</w:t>
             </w:r>
           </w:p>
         </w:tc>
@@ -252,7 +252,7 @@
                 <w:color w:val="FFFFFF"/>
                 <w:sz w:val="19"/>
               </w:rPr>
-              <w:t>Try 5 (45.5 phút)</w:t>
+              <w:t>Try 5 (45.5 min)</w:t>
             </w:r>
           </w:p>
         </w:tc>
@@ -277,7 +277,7 @@
                 <w:color w:val="FFFFFF"/>
                 <w:sz w:val="19"/>
               </w:rPr>
-              <w:t>Trung bình</w:t>
+              <w:t>Multi-Trial Avg</w:t>
             </w:r>
           </w:p>
         </w:tc>
@@ -947,7 +947,7 @@
                 <w:color w:val="2C3E50"/>
                 <w:sz w:val="20"/>
               </w:rPr>
-              <w:t>Đánh giá quá nhiệt Motor C (transC): Qua tất cả các lần thử, Motor C luôn tiêu thụ dòng điện trung bình cao hơn khoảng 50% - 70% so với các motor đối xứng khác (~45.7A so với ~29.4A). Điều này khiến Motor C sinh nhiệt nhanh gấp đôi và chạm ngưỡng Cảnh báo (Warning - 85°C) ở Lần thử 5 khi chạy 45 phút liên tục.</w:t>
+              <w:t>Travel Drive C Anomaly: Drive C (transC) consistently draws 50-70% more average current compared to its symmetrical counterparts (45.7A avg vs. ~29.4A). Consequently, its temperature rise is almost double, peaking at 85.0°C in Trial 5. This triggers the 85.0°C system temperature warning limit.</w:t>
             </w:r>
           </w:p>
         </w:tc>
@@ -966,9 +966,9 @@
         <w:rPr>
           <w:b/>
           <w:color w:val="1B365D"/>
-          <w:sz w:val="28"/>
+          <w:sz w:val="26"/>
         </w:rPr>
-        <w:t>3. So sánh Telemetry pha làm mát tự nhiên (Natural Cooling)</w:t>
+        <w:t>3. Natural Cooldown Telemetry Comparison (Cooling Phase)</w:t>
       </w:r>
     </w:p>
     <w:p>
@@ -976,7 +976,7 @@
         <w:spacing w:after="160"/>
       </w:pPr>
       <w:r>
-        <w:t>Bảng thống kê sự suy giảm nhiệt độ trong trạng thái dừng máy để nguội tự nhiên (Try 1, 2, 3, 5). Lưu ý: Đối với Lần thử 5, do có khoảng ngắt ghi log 9.2 phút lúc đầu, tổng mức giảm nhiệt thực tế của Motor C sau 25.57 phút là từ 85°C về 71°C (giảm 14°C, tốc độ làm mát thực tế là 0.55°C/phút).</w:t>
+        <w:t>The table below details the temperature decay during stationary parked periods. Note on Try 5: Due to a 9.20-minute unlogged gap at the start of cooldown, the actual temperature drop for Drive C over the entire 25.57-minute rest period was from 85.0°C to 71.0°C (a drop of 14.0°C at 0.55°C/min).</w:t>
       </w:r>
     </w:p>
     <w:tbl>
@@ -1023,7 +1023,7 @@
                 <w:color w:val="FFFFFF"/>
                 <w:sz w:val="19"/>
               </w:rPr>
-              <w:t>Động cơ</w:t>
+              <w:t>Motor ID</w:t>
             </w:r>
           </w:p>
         </w:tc>
@@ -1048,7 +1048,7 @@
                 <w:color w:val="FFFFFF"/>
                 <w:sz w:val="19"/>
               </w:rPr>
-              <w:t>Try 1 (59.9 phút)</w:t>
+              <w:t>Try 1 (59.9 min)</w:t>
             </w:r>
           </w:p>
         </w:tc>
@@ -1073,7 +1073,7 @@
                 <w:color w:val="FFFFFF"/>
                 <w:sz w:val="19"/>
               </w:rPr>
-              <w:t>Try 2 (10.7 phút)</w:t>
+              <w:t>Try 2 (10.7 min)</w:t>
             </w:r>
           </w:p>
         </w:tc>
@@ -1098,7 +1098,7 @@
                 <w:color w:val="FFFFFF"/>
                 <w:sz w:val="19"/>
               </w:rPr>
-              <w:t>Try 3 (59.4 phút)</w:t>
+              <w:t>Try 3 (59.4 min)</w:t>
             </w:r>
           </w:p>
         </w:tc>
@@ -1123,7 +1123,7 @@
                 <w:color w:val="FFFFFF"/>
                 <w:sz w:val="19"/>
               </w:rPr>
-              <w:t>Try 5 (16.4 phút)*</w:t>
+              <w:t>Try 5 (16.4 min)*</w:t>
             </w:r>
           </w:p>
         </w:tc>
@@ -1690,7 +1690,7 @@
                 <w:color w:val="2C3E50"/>
                 <w:sz w:val="20"/>
               </w:rPr>
-              <w:t>Định luật làm mát của Newton: Tốc độ nguội tự nhiên của Motor C tỉ lệ thuận với hiệu nhiệt độ giữa motor và môi trường. Ở nhiệt độ 85°C (Try 5), tốc độ nguội ban đầu rất cao đạt 0.98°C/phút, nhưng giảm xuống 0.31°C/phút khi nhiệt độ hạ xuống 76°C. Tổng thời gian nghỉ 25 phút là đủ để reset hoàn toàn ngân sách nhiệt cho động cơ.</w:t>
+              <w:t>Newton's Law of Cooling: Cooldown rates are highly dependent on the temperature gradient. At 85°C (Try 5), Drive C cooled at 0.98°C/min initially. As the temperature fell to 76°C, the rate slowed to 0.31°C/min. A 20-minute pause is sufficient to reset the motor's thermal budget.</w:t>
             </w:r>
           </w:p>
         </w:tc>
@@ -1709,9 +1709,9 @@
         <w:rPr>
           <w:b/>
           <w:color w:val="1B365D"/>
-          <w:sz w:val="28"/>
+          <w:sz w:val="26"/>
         </w:rPr>
-        <w:t>4. Kết luận &amp; Đánh giá Kỹ thuật</w:t>
+        <w:t>4. Engineering Evaluation &amp; Conclusions</w:t>
       </w:r>
     </w:p>
     <w:p>
@@ -1722,10 +1722,10 @@
         <w:rPr>
           <w:b/>
         </w:rPr>
-        <w:t xml:space="preserve">1. Xác nhận lỗi phanh cơ khí bánh xe C: </w:t>
+        <w:t xml:space="preserve">1. Drive C (transC) Abnormal Behavior: </w:t>
       </w:r>
       <w:r>
-        <w:t>Số liệu nhất quán qua cả 5 lần thử chứng minh rằng Motor C chịu tải trọng cơ học lớn bất thường. Sự chênh lệch lớn về dòng điện (45.7A so với ~29.4A) dẫn đến tổn thất nhiệt đồng và sắt tăng nhanh (tỉ lệ bình phương dòng điện), làm nhiệt độ vỏ motor tăng nhanh hơn gấp đôi so với các trục khác.</w:t>
+        <w:t>Drive C displays a persistent current draw discrepancy (+50% to +70% compared to Drive A, B, and D) and double the heating rate across all valid trials. This is an abnormal operational signature. To isolate and rule out any systemic effects from the crane's vehicle architecture, physical replacement is required.</w:t>
       </w:r>
     </w:p>
     <w:p>
@@ -1736,10 +1736,10 @@
         <w:rPr>
           <w:b/>
         </w:rPr>
-        <w:t xml:space="preserve">2. Hiệu lực của cơ chế bảo vệ PLC: </w:t>
+        <w:t xml:space="preserve">2. PLC Protection &amp; Safety Margins: </w:t>
       </w:r>
       <w:r>
-        <w:t>Nhiệt độ đỉnh 85.0°C trên Motor C vẫn nằm trong tầm kiểm soát an toàn của chương trình PLC. Vì ngưỡng cutback bắt đầu ở 110.0°C, hệ thống không kích hoạt giảm hiệu suất sớm trong suốt quá trình thử nghiệm. Tuy nhiên, mức nhiệt này đã kích hoạt cảnh báo Warning nhiệt độ trên Driver/HMI, chứng minh hệ thống cảnh báo hoạt động chính xác.</w:t>
+        <w:t>The peak temperature of 85.0°C remains safely below the PLC's automatic thermal cutback threshold of 110.0°C. This confirms that the crane operates at full performance during all trials without premature software limitations. The HMI warning limit of 85.0°C functioned correctly to alert operators.</w:t>
       </w:r>
     </w:p>
     <w:p>
@@ -1750,10 +1750,10 @@
         <w:rPr>
           <w:b/>
         </w:rPr>
-        <w:t xml:space="preserve">3. Thiết lập chu kỳ nghỉ (Duty Cycle): </w:t>
+        <w:t xml:space="preserve">3. Duty Cycle Validation: </w:t>
       </w:r>
       <w:r>
-        <w:t>Qua thực nghiệm ở Lần thử 5, một khoảng dừng nghỉ 20-25 phút hoàn toàn đủ để đưa động cơ C từ trạng thái nguy hiểm 85°C về mức an toàn 71°C nhờ tốc độ làm mát cao ở dải nhiệt độ lớn.</w:t>
+        <w:t>Thermal telemetry indicates that a rest period of 20-25 minutes is adequate to lower temperatures from the 85°C warning limit to a stable baseline (~71°C), providing clear guidelines for continuous testing.</w:t>
       </w:r>
     </w:p>
     <w:p>
@@ -1764,9 +1764,9 @@
         <w:rPr>
           <w:b/>
           <w:color w:val="1B365D"/>
-          <w:sz w:val="28"/>
+          <w:sz w:val="26"/>
         </w:rPr>
-        <w:t>5. Khuyến nghị bảo dưỡng &amp; vận hành</w:t>
+        <w:t>5. Actionable Maintenance Recommendations</w:t>
       </w:r>
     </w:p>
     <w:p>
@@ -1778,10 +1778,10 @@
         <w:rPr>
           <w:b/>
         </w:rPr>
-        <w:t>Tiến hành kiểm tra kẹp phanh (brake caliper) bánh xe C:</w:t>
+        <w:t>Replace the Travel Drive C Motor Assembly:</w:t>
       </w:r>
       <w:r>
-        <w:t xml:space="preserve"> Kiểm tra xi-lanh giải phóng phanh thủy lực, má phanh có bị bó cứng hoặc cạ vào đĩa phanh hay không.</w:t>
+        <w:t xml:space="preserve"> Abort further high-temperature travel runs and replace the transC motor assembly. This will isolate the problem and confirm if the discrepancy is driven by vehicle architecture or physical drive components.</w:t>
       </w:r>
     </w:p>
     <w:p>
@@ -1793,10 +1793,10 @@
         <w:rPr>
           <w:b/>
         </w:rPr>
-        <w:t>Kiểm tra hộp số hành tinh (gear hub) bánh xe C:</w:t>
+        <w:t>Inspect Gearbox and Mechanical Hub C:</w:t>
       </w:r>
       <w:r>
-        <w:t xml:space="preserve"> Xác định xem có bị cạn dầu bôi trơn, kẹt vòng bi hoặc rơ-lỏng cơ khí gây tăng ma sát hay không.</w:t>
+        <w:t xml:space="preserve"> Check oil levels, planetary gears, and bearings on Wheel C to check for mechanical friction.</w:t>
       </w:r>
     </w:p>
     <w:p>
@@ -1808,10 +1808,10 @@
         <w:rPr>
           <w:b/>
         </w:rPr>
-        <w:t>Giới hạn thời gian chạy tạm thời:</w:t>
+        <w:t>Implement Temporary Runtime Limits:</w:t>
       </w:r>
       <w:r>
-        <w:t xml:space="preserve"> Trước khi khắc phục xong lỗi phanh, giới hạn thời gian di chuyển liên tục dưới tải là 30 phút, sau đó phải dừng nghỉ tối thiểu 20 phút.</w:t>
+        <w:t xml:space="preserve"> Until the motor is replaced, limit continuous laden travel to 30 minutes, followed by a 20-minute parked cooldown period.</w:t>
       </w:r>
     </w:p>
     <w:p>
@@ -1823,10 +1823,10 @@
         <w:rPr>
           <w:b/>
         </w:rPr>
-        <w:t>Khắc phục cảm biến nhiệt độ Winch B:</w:t>
+        <w:t>Winch B Temperature Sensor Overhaul:</w:t>
       </w:r>
       <w:r>
-        <w:t xml:space="preserve"> Thay thế cảm biến PT100 của Winch B bị hỏng (đang chỉ đọc 0.0°C) để đảm bảo an toàn cho hệ thống tời nâng.</w:t>
+        <w:t xml:space="preserve"> Replace the faulted Winch B PT100 sensor (currently reading 0.0°C) to restore safety protections on the hoist system.</w:t>
       </w:r>
     </w:p>
     <w:sectPr>

</xml_diff>